<commit_message>
Reframe Stage 1 as specification conformance
</commit_message>
<xml_diff>
--- a/paper/Module_14_Final_Paper_Pruned_Evidence_Gate_Ravi_Bajaj.docx
+++ b/paper/Module_14_Final_Paper_Pruned_Evidence_Gate_Ravi_Bajaj.docx
@@ -56,7 +56,7 @@
         <w:rPr>
           <w:rFonts w:ascii="Calibri" w:hAnsi="Calibri"/>
         </w:rPr>
-        <w:t>Large language models can draft fluent medication alerts that sound stronger than the evidence they cite. This paper narrows the capstone to one workflow: pharmacogenomic and genomic medication-alert text. I implement a synthetic pre-display evidence gate with three checks: endpoint/actionability, population fit, and citation/guideline support. In 30 synthetic cases spanning CPIC-style medication-gene pairs, variant uncertainty, population transport, and unsupported genetics claims, ungated drafts overclaimed evidence in 20 cases. The gated controller reduced remaining overclaiming to 0/30 while allowing 10/10 aligned bounded alerts and producing no inappropriate denials in this Stage 1 scaffold. These results demonstrate implementation consistency and construct validity against author-designed cases, not independent clinical safety or patient benefit. The planned Stage 2 evaluation compares ungated and gated LLM drafts on independently authored cases with blinded reviewer adjudication of overclaiming, inappropriate denial, calibration, and error categories.</w:t>
+        <w:t>Large language models can draft fluent medication alerts that sound stronger than the evidence they cite. This paper narrows the capstone to one workflow: pharmacogenomic and genomic medication-alert text. I implement a synthetic pre-display evidence gate with three checks: endpoint/actionability, population fit, and citation/guideline support. In 30 author-designed synthetic cases spanning CPIC-style medication-gene pairs, variant uncertainty, population transport, and unsupported genetics claims, the controller routed all 20 designed overclaim archetypes to a narrowing, abstention, or denial action and allowed all 10 bounded alerts. These counts demonstrate specification conformance against the author-designed case bank, not independent clinical safety, diagnostic accuracy, generalization, or patient benefit. The planned Stage 2 evaluation compares ungated and gated LLM drafts on independently authored cases with blinded reviewer adjudication of overclaiming, inappropriate denial, calibration, and error categories.</w:t>
       </w:r>
     </w:p>
     <w:p>
@@ -460,7 +460,7 @@
         <w:pStyle w:val="Heading1"/>
       </w:pPr>
       <w:r>
-        <w:t>4. Stage 1 Synthetic Evaluation</w:t>
+        <w:t>4. Stage 1 Specification-Conformance Scaffold</w:t>
       </w:r>
     </w:p>
     <w:p>
@@ -468,7 +468,7 @@
         <w:rPr>
           <w:rFonts w:ascii="Calibri" w:hAnsi="Calibri"/>
         </w:rPr>
-        <w:t>The current case bank contains 30 synthetic cases. Ten are bounded aligned alerts; twenty intentionally contain overclaiming through universal action language, unsupported genetics, population mismatch, citation/guideline weakness, variant uncertainty, or obsolete/context-shifted evidence. Each case has an expected action and expected primary gate.</w:t>
+        <w:t>The current case bank contains 30 author-designed synthetic cases. Ten are bounded aligned alerts; twenty intentionally contain overclaim archetypes involving universal action language, unsupported genetics, population mismatch, citation/guideline weakness, variant uncertainty, or obsolete/context-shifted evidence. The 20/10 split is a stress-test design choice, not a measured clinical base rate. Each case has an expected action and expected primary gate.</w:t>
       </w:r>
     </w:p>
     <w:p>
@@ -518,7 +518,7 @@
           <w:color w:val="555555"/>
           <w:sz w:val="18"/>
         </w:rPr>
-        <w:t>Figure 2. Stage 1 metrics on author-designed synthetic cases.</w:t>
+        <w:t>Figure 2. Stage 1 specification-conformance counts on author-designed synthetic archetypes.</w:t>
       </w:r>
     </w:p>
     <w:tbl>
@@ -609,18 +609,8 @@
             <w:vAlign w:val="center"/>
           </w:tcPr>
           <w:p>
-            <w:pPr>
-              <w:spacing w:after="0"/>
-            </w:pPr>
-            <w:r/>
             <w:r>
-              <w:rPr>
-                <w:rFonts w:ascii="Calibri" w:hAnsi="Calibri"/>
-                <w:b w:val="0"/>
-                <w:color w:val="000000"/>
-                <w:sz w:val="19"/>
-              </w:rPr>
-              <w:t>Overclaim reduction</w:t>
+              <w:t>Author-designed overclaim share</w:t>
             </w:r>
           </w:p>
         </w:tc>
@@ -630,18 +620,8 @@
             <w:vAlign w:val="center"/>
           </w:tcPr>
           <w:p>
-            <w:pPr>
-              <w:spacing w:after="0"/>
-            </w:pPr>
-            <w:r/>
             <w:r>
-              <w:rPr>
-                <w:rFonts w:ascii="Calibri" w:hAnsi="Calibri"/>
-                <w:b w:val="0"/>
-                <w:color w:val="000000"/>
-                <w:sz w:val="19"/>
-              </w:rPr>
-              <w:t>0.67</w:t>
+              <w:t>20/30</w:t>
             </w:r>
           </w:p>
         </w:tc>
@@ -651,18 +631,8 @@
             <w:vAlign w:val="center"/>
           </w:tcPr>
           <w:p>
-            <w:pPr>
-              <w:spacing w:after="0"/>
-            </w:pPr>
-            <w:r/>
             <w:r>
-              <w:rPr>
-                <w:rFonts w:ascii="Calibri" w:hAnsi="Calibri"/>
-                <w:b w:val="0"/>
-                <w:color w:val="000000"/>
-                <w:sz w:val="19"/>
-              </w:rPr>
-              <w:t>Construct-validity signal only.</w:t>
+              <w:t>Stress-test case mix, not a measured clinical base rate.</w:t>
             </w:r>
           </w:p>
         </w:tc>
@@ -674,18 +644,8 @@
             <w:vAlign w:val="center"/>
           </w:tcPr>
           <w:p>
-            <w:pPr>
-              <w:spacing w:after="0"/>
-            </w:pPr>
-            <w:r/>
             <w:r>
-              <w:rPr>
-                <w:rFonts w:ascii="Calibri" w:hAnsi="Calibri"/>
-                <w:b w:val="0"/>
-                <w:color w:val="000000"/>
-                <w:sz w:val="19"/>
-              </w:rPr>
-              <w:t>Sensitivity</w:t>
+              <w:t>Remaining after gate</w:t>
             </w:r>
           </w:p>
         </w:tc>
@@ -695,18 +655,8 @@
             <w:vAlign w:val="center"/>
           </w:tcPr>
           <w:p>
-            <w:pPr>
-              <w:spacing w:after="0"/>
-            </w:pPr>
-            <w:r/>
             <w:r>
-              <w:rPr>
-                <w:rFonts w:ascii="Calibri" w:hAnsi="Calibri"/>
-                <w:b w:val="0"/>
-                <w:color w:val="000000"/>
-                <w:sz w:val="19"/>
-              </w:rPr>
-              <w:t>1.00</w:t>
+              <w:t>0/30</w:t>
             </w:r>
           </w:p>
         </w:tc>
@@ -716,18 +666,8 @@
             <w:vAlign w:val="center"/>
           </w:tcPr>
           <w:p>
-            <w:pPr>
-              <w:spacing w:after="0"/>
-            </w:pPr>
-            <w:r/>
             <w:r>
-              <w:rPr>
-                <w:rFonts w:ascii="Calibri" w:hAnsi="Calibri"/>
-                <w:b w:val="0"/>
-                <w:color w:val="000000"/>
-                <w:sz w:val="19"/>
-              </w:rPr>
-              <w:t>Detects intentionally overstrong claims in this synthetic bank.</w:t>
+              <w:t>Specification-conformance count only.</w:t>
             </w:r>
           </w:p>
         </w:tc>
@@ -739,18 +679,8 @@
             <w:vAlign w:val="center"/>
           </w:tcPr>
           <w:p>
-            <w:pPr>
-              <w:spacing w:after="0"/>
-            </w:pPr>
-            <w:r/>
             <w:r>
-              <w:rPr>
-                <w:rFonts w:ascii="Calibri" w:hAnsi="Calibri"/>
-                <w:b w:val="0"/>
-                <w:color w:val="000000"/>
-                <w:sz w:val="19"/>
-              </w:rPr>
-              <w:t>Specificity</w:t>
+              <w:t>Designed overclaim archetypes blocked</w:t>
             </w:r>
           </w:p>
         </w:tc>
@@ -760,18 +690,8 @@
             <w:vAlign w:val="center"/>
           </w:tcPr>
           <w:p>
-            <w:pPr>
-              <w:spacing w:after="0"/>
-            </w:pPr>
-            <w:r/>
             <w:r>
-              <w:rPr>
-                <w:rFonts w:ascii="Calibri" w:hAnsi="Calibri"/>
-                <w:b w:val="0"/>
-                <w:color w:val="000000"/>
-                <w:sz w:val="19"/>
-              </w:rPr>
-              <w:t>1.00</w:t>
+              <w:t>20/20</w:t>
             </w:r>
           </w:p>
         </w:tc>
@@ -781,18 +701,8 @@
             <w:vAlign w:val="center"/>
           </w:tcPr>
           <w:p>
-            <w:pPr>
-              <w:spacing w:after="0"/>
-            </w:pPr>
-            <w:r/>
             <w:r>
-              <w:rPr>
-                <w:rFonts w:ascii="Calibri" w:hAnsi="Calibri"/>
-                <w:b w:val="0"/>
-                <w:color w:val="000000"/>
-                <w:sz w:val="19"/>
-              </w:rPr>
-              <w:t>Allows aligned bounded alerts in this synthetic bank.</w:t>
+              <w:t>Controller follows the synthetic spec for intentionally overstrong claims.</w:t>
             </w:r>
           </w:p>
         </w:tc>
@@ -804,18 +714,8 @@
             <w:vAlign w:val="center"/>
           </w:tcPr>
           <w:p>
-            <w:pPr>
-              <w:spacing w:after="0"/>
-            </w:pPr>
-            <w:r/>
             <w:r>
-              <w:rPr>
-                <w:rFonts w:ascii="Calibri" w:hAnsi="Calibri"/>
-                <w:b w:val="0"/>
-                <w:color w:val="000000"/>
-                <w:sz w:val="19"/>
-              </w:rPr>
-              <w:t>Brier score</w:t>
+              <w:t>Bounded alerts allowed</w:t>
             </w:r>
           </w:p>
         </w:tc>
@@ -825,18 +725,8 @@
             <w:vAlign w:val="center"/>
           </w:tcPr>
           <w:p>
-            <w:pPr>
-              <w:spacing w:after="0"/>
-            </w:pPr>
-            <w:r/>
             <w:r>
-              <w:rPr>
-                <w:rFonts w:ascii="Calibri" w:hAnsi="Calibri"/>
-                <w:b w:val="0"/>
-                <w:color w:val="000000"/>
-                <w:sz w:val="19"/>
-              </w:rPr>
-              <w:t>0.112</w:t>
+              <w:t>10/10</w:t>
             </w:r>
           </w:p>
         </w:tc>
@@ -846,18 +736,8 @@
             <w:vAlign w:val="center"/>
           </w:tcPr>
           <w:p>
-            <w:pPr>
-              <w:spacing w:after="0"/>
-            </w:pPr>
-            <w:r/>
             <w:r>
-              <w:rPr>
-                <w:rFonts w:ascii="Calibri" w:hAnsi="Calibri"/>
-                <w:b w:val="0"/>
-                <w:color w:val="000000"/>
-                <w:sz w:val="19"/>
-              </w:rPr>
-              <w:t>Preliminary risk-score calibration diagnostic.</w:t>
+              <w:t>Controller permits aligned bounded alerts in the synthetic case bank.</w:t>
             </w:r>
           </w:p>
         </w:tc>
@@ -869,17 +749,7 @@
             <w:vAlign w:val="center"/>
           </w:tcPr>
           <w:p>
-            <w:pPr>
-              <w:spacing w:after="0"/>
-            </w:pPr>
-            <w:r/>
             <w:r>
-              <w:rPr>
-                <w:rFonts w:ascii="Calibri" w:hAnsi="Calibri"/>
-                <w:b w:val="0"/>
-                <w:color w:val="000000"/>
-                <w:sz w:val="19"/>
-              </w:rPr>
               <w:t>Inappropriate denial</w:t>
             </w:r>
           </w:p>
@@ -890,18 +760,8 @@
             <w:vAlign w:val="center"/>
           </w:tcPr>
           <w:p>
-            <w:pPr>
-              <w:spacing w:after="0"/>
-            </w:pPr>
-            <w:r/>
             <w:r>
-              <w:rPr>
-                <w:rFonts w:ascii="Calibri" w:hAnsi="Calibri"/>
-                <w:b w:val="0"/>
-                <w:color w:val="000000"/>
-                <w:sz w:val="19"/>
-              </w:rPr>
-              <w:t>0</w:t>
+              <w:t>0/10</w:t>
             </w:r>
           </w:p>
         </w:tc>
@@ -911,17 +771,7 @@
             <w:vAlign w:val="center"/>
           </w:tcPr>
           <w:p>
-            <w:pPr>
-              <w:spacing w:after="0"/>
-            </w:pPr>
-            <w:r/>
             <w:r>
-              <w:rPr>
-                <w:rFonts w:ascii="Calibri" w:hAnsi="Calibri"/>
-                <w:b w:val="0"/>
-                <w:color w:val="000000"/>
-                <w:sz w:val="19"/>
-              </w:rPr>
               <w:t>No aligned bounded alerts were denied too strongly in Stage 1.</w:t>
             </w:r>
           </w:p>
@@ -1084,7 +934,7 @@
         <w:rPr>
           <w:rFonts w:ascii="Calibri" w:hAnsi="Calibri"/>
         </w:rPr>
-        <w:t>A cohesive capstone can be built from the original implementation by pruning. The revised project studies one practical genetics workflow and evaluates whether a three-gate controller prevents LLM alert text from inflating guideline-supported evidence into unsupported clinical authority.</w:t>
+        <w:t>A cohesive capstone can be built from the original implementation by pruning. The revised project studies one practical genetics workflow and evaluates whether a three-gate controller can discipline LLM alert text so it does not inflate guideline-supported evidence into unsupported clinical authority.</w:t>
       </w:r>
     </w:p>
     <w:p>

</xml_diff>

<commit_message>
Fix evidence gate audit issues
</commit_message>
<xml_diff>
--- a/paper/Module_14_Final_Paper_Pruned_Evidence_Gate_Ravi_Bajaj.docx
+++ b/paper/Module_14_Final_Paper_Pruned_Evidence_Gate_Ravi_Bajaj.docx
@@ -56,7 +56,7 @@
         <w:rPr>
           <w:rFonts w:ascii="Calibri" w:hAnsi="Calibri"/>
         </w:rPr>
-        <w:t>Large language models can draft fluent medication alerts that sound stronger than the evidence they cite. This paper narrows the capstone to one workflow: pharmacogenomic and genomic medication-alert text. I implement a synthetic pre-display evidence gate with three checks: endpoint/actionability, population fit, and citation/guideline support. In 30 author-designed synthetic cases spanning CPIC-style medication-gene pairs, variant uncertainty, population transport, and unsupported genetics claims, the controller routed all 20 designed overclaim archetypes to a narrowing, abstention, or denial action and allowed all 10 bounded alerts. These counts demonstrate specification conformance against the author-designed case bank, not independent clinical safety, diagnostic accuracy, generalization, or patient benefit. The planned Stage 2 evaluation compares ungated and gated LLM drafts on independently authored cases with blinded reviewer adjudication of overclaiming, inappropriate denial, calibration, and error categories.</w:t>
+        <w:t>Large language models can draft fluent medication alerts that sound stronger than the evidence they cite. This paper narrows the capstone to one workflow: pharmacogenomic and genomic medication-alert text. I implement a synthetic pre-display evidence gate with three checks: citation/guideline support, population fit, and endpoint/actionability. Stage 1 does not call an LLM or extract evidence features from free text; it tests a deterministic controller over structured evidence annotations. In 30 author-designed synthetic cases, the controller blocked or narrowed all 20 designed overclaim archetypes, allowed all 10 bounded alerts, and produced no inappropriate denials. Action conformance was 30/30, while primary-gate conformance was 28/30 because citation-first precedence changed the recorded primary gate for PGX19 and PGX24. These counts demonstrate specification conformance against the author-designed case bank, not independent clinical safety, diagnostic accuracy, generalization, or patient benefit.</w:t>
       </w:r>
     </w:p>
     <w:p>
@@ -120,7 +120,7 @@
         <w:rPr>
           <w:rFonts w:ascii="Calibri" w:hAnsi="Calibri"/>
         </w:rPr>
-        <w:t>The controller is a deterministic pre-display gate. It is not presented as an autonomous clinical agent. It receives a drafted alert claim and structured evidence features, then selects one of five permission levels: allow bounded alert, narrow claim, abstain for population fit, abstain for citation/guideline support, or deny unsupported action.</w:t>
+        <w:t>The controller is a deterministic pre-display gate. It is not presented as an autonomous clinical agent. In Stage 1, it receives a synthetic candidate alert plus structured evidence annotations assigned in the case bank; it does not parse the draft_claim text, call an LLM, verify citations, or extract EHR/population-fit features. Those extraction tasks are the central Stage 2 dependency. The fixed precedence order is citation/guideline support first, population fit second, and endpoint/actionability third. The controller selects one of five permission levels: allow bounded alert, narrow claim, abstain for population fit, abstain for citation/guideline support, or deny unsupported action.</w:t>
       </w:r>
     </w:p>
     <w:p>
@@ -261,18 +261,8 @@
             <w:vAlign w:val="center"/>
           </w:tcPr>
           <w:p>
-            <w:pPr>
-              <w:spacing w:after="0"/>
-            </w:pPr>
-            <w:r/>
             <w:r>
-              <w:rPr>
-                <w:rFonts w:ascii="Calibri" w:hAnsi="Calibri"/>
-                <w:b w:val="0"/>
-                <w:color w:val="000000"/>
-                <w:sz w:val="19"/>
-              </w:rPr>
-              <w:t>Endpoint/actionability</w:t>
+              <w:t>Citation/guideline support</w:t>
             </w:r>
           </w:p>
         </w:tc>
@@ -282,18 +272,8 @@
             <w:vAlign w:val="center"/>
           </w:tcPr>
           <w:p>
-            <w:pPr>
-              <w:spacing w:after="0"/>
-            </w:pPr>
-            <w:r/>
             <w:r>
-              <w:rPr>
-                <w:rFonts w:ascii="Calibri" w:hAnsi="Calibri"/>
-                <w:b w:val="0"/>
-                <w:color w:val="000000"/>
-                <w:sz w:val="19"/>
-              </w:rPr>
-              <w:t>Does the evidence support medication action, only surrogate/process language, or no action?</w:t>
+              <w:t>Is the cited guideline real, current, relevant, and strong enough for the claim?</w:t>
             </w:r>
           </w:p>
         </w:tc>
@@ -303,18 +283,8 @@
             <w:vAlign w:val="center"/>
           </w:tcPr>
           <w:p>
-            <w:pPr>
-              <w:spacing w:after="0"/>
-            </w:pPr>
-            <w:r/>
             <w:r>
-              <w:rPr>
-                <w:rFonts w:ascii="Calibri" w:hAnsi="Calibri"/>
-                <w:b w:val="0"/>
-                <w:color w:val="000000"/>
-                <w:sz w:val="19"/>
-              </w:rPr>
-              <w:t>Allow bounded alert, narrow wording, or deny unsupported action.</w:t>
+              <w:t>Deny fabricated claims; abstain on uncertain/conflicting support.</w:t>
             </w:r>
           </w:p>
         </w:tc>
@@ -326,17 +296,7 @@
             <w:vAlign w:val="center"/>
           </w:tcPr>
           <w:p>
-            <w:pPr>
-              <w:spacing w:after="0"/>
-            </w:pPr>
-            <w:r/>
             <w:r>
-              <w:rPr>
-                <w:rFonts w:ascii="Calibri" w:hAnsi="Calibri"/>
-                <w:b w:val="0"/>
-                <w:color w:val="000000"/>
-                <w:sz w:val="19"/>
-              </w:rPr>
               <w:t>Population fit</w:t>
             </w:r>
           </w:p>
@@ -347,17 +307,7 @@
             <w:vAlign w:val="center"/>
           </w:tcPr>
           <w:p>
-            <w:pPr>
-              <w:spacing w:after="0"/>
-            </w:pPr>
-            <w:r/>
             <w:r>
-              <w:rPr>
-                <w:rFonts w:ascii="Calibri" w:hAnsi="Calibri"/>
-                <w:b w:val="0"/>
-                <w:color w:val="000000"/>
-                <w:sz w:val="19"/>
-              </w:rPr>
               <w:t>Does source evidence plausibly fit the target patient/cohort?</w:t>
             </w:r>
           </w:p>
@@ -368,17 +318,7 @@
             <w:vAlign w:val="center"/>
           </w:tcPr>
           <w:p>
-            <w:pPr>
-              <w:spacing w:after="0"/>
-            </w:pPr>
-            <w:r/>
             <w:r>
-              <w:rPr>
-                <w:rFonts w:ascii="Calibri" w:hAnsi="Calibri"/>
-                <w:b w:val="0"/>
-                <w:color w:val="000000"/>
-                <w:sz w:val="19"/>
-              </w:rPr>
               <w:t>Require source-specific validation or abstain from transport.</w:t>
             </w:r>
           </w:p>
@@ -391,18 +331,8 @@
             <w:vAlign w:val="center"/>
           </w:tcPr>
           <w:p>
-            <w:pPr>
-              <w:spacing w:after="0"/>
-            </w:pPr>
-            <w:r/>
             <w:r>
-              <w:rPr>
-                <w:rFonts w:ascii="Calibri" w:hAnsi="Calibri"/>
-                <w:b w:val="0"/>
-                <w:color w:val="000000"/>
-                <w:sz w:val="19"/>
-              </w:rPr>
-              <w:t>Citation/guideline support</w:t>
+              <w:t>Endpoint/actionability</w:t>
             </w:r>
           </w:p>
         </w:tc>
@@ -412,18 +342,8 @@
             <w:vAlign w:val="center"/>
           </w:tcPr>
           <w:p>
-            <w:pPr>
-              <w:spacing w:after="0"/>
-            </w:pPr>
-            <w:r/>
             <w:r>
-              <w:rPr>
-                <w:rFonts w:ascii="Calibri" w:hAnsi="Calibri"/>
-                <w:b w:val="0"/>
-                <w:color w:val="000000"/>
-                <w:sz w:val="19"/>
-              </w:rPr>
-              <w:t>Is the cited guideline real, current, relevant, and strong enough for the claim?</w:t>
+              <w:t>Does the evidence support medication action, only surrogate/process language, or no action?</w:t>
             </w:r>
           </w:p>
         </w:tc>
@@ -433,18 +353,8 @@
             <w:vAlign w:val="center"/>
           </w:tcPr>
           <w:p>
-            <w:pPr>
-              <w:spacing w:after="0"/>
-            </w:pPr>
-            <w:r/>
             <w:r>
-              <w:rPr>
-                <w:rFonts w:ascii="Calibri" w:hAnsi="Calibri"/>
-                <w:b w:val="0"/>
-                <w:color w:val="000000"/>
-                <w:sz w:val="19"/>
-              </w:rPr>
-              <w:t>Deny fabricated claims; abstain on uncertain/conflicting support.</w:t>
+              <w:t>Allow bounded alert, narrow wording, or deny unsupported action.</w:t>
             </w:r>
           </w:p>
         </w:tc>
@@ -468,7 +378,7 @@
         <w:rPr>
           <w:rFonts w:ascii="Calibri" w:hAnsi="Calibri"/>
         </w:rPr>
-        <w:t>The current case bank contains 30 author-designed synthetic cases. Ten are bounded aligned alerts; twenty intentionally contain overclaim archetypes involving universal action language, unsupported genetics, population mismatch, citation/guideline weakness, variant uncertainty, or obsolete/context-shifted evidence. The 20/10 split is a stress-test design choice, not a measured clinical base rate. Each case has an expected action and expected primary gate.</w:t>
+        <w:t>The current case bank contains 30 author-designed synthetic cases. Ten are bounded aligned alerts; twenty intentionally contain overclaim archetypes involving universal action language, unsupported genetics, population mismatch, citation/guideline weakness, variant uncertainty, or obsolete/context-shifted evidence. The 20/10 split is a stress-test design choice, not a measured clinical base rate. Each case has an expected action and expected primary gate, but the controller does not read either expected label.</w:t>
       </w:r>
     </w:p>
     <w:p>
@@ -645,7 +555,7 @@
           </w:tcPr>
           <w:p>
             <w:r>
-              <w:t>Remaining after gate</w:t>
+              <w:t>Overclaim archetypes allowed unchanged</w:t>
             </w:r>
           </w:p>
         </w:tc>
@@ -656,7 +566,7 @@
           </w:tcPr>
           <w:p>
             <w:r>
-              <w:t>0/30</w:t>
+              <w:t>0/20</w:t>
             </w:r>
           </w:p>
         </w:tc>
@@ -667,7 +577,7 @@
           </w:tcPr>
           <w:p>
             <w:r>
-              <w:t>Specification-conformance count only.</w:t>
+              <w:t>Derived as overclaim cases that reached allow bounded alert unchanged.</w:t>
             </w:r>
           </w:p>
         </w:tc>
@@ -702,7 +612,7 @@
           </w:tcPr>
           <w:p>
             <w:r>
-              <w:t>Controller follows the synthetic spec for intentionally overstrong claims.</w:t>
+              <w:t>Controller routes intentionally overstrong claims to narrow, abstain, or deny.</w:t>
             </w:r>
           </w:p>
         </w:tc>
@@ -750,7 +660,7 @@
           </w:tcPr>
           <w:p>
             <w:r>
-              <w:t>Inappropriate denial</w:t>
+              <w:t>Action conformance</w:t>
             </w:r>
           </w:p>
         </w:tc>
@@ -761,6 +671,71 @@
           </w:tcPr>
           <w:p>
             <w:r>
+              <w:t>30/30</w:t>
+            </w:r>
+          </w:p>
+        </w:tc>
+        <w:tc>
+          <w:tcPr>
+            <w:tcW w:type="dxa" w:w="5060"/>
+            <w:vAlign w:val="center"/>
+          </w:tcPr>
+          <w:p>
+            <w:r>
+              <w:t>Actual action matched expected action for all cases.</w:t>
+            </w:r>
+          </w:p>
+        </w:tc>
+      </w:tr>
+      <w:tr>
+        <w:tc>
+          <w:tcPr>
+            <w:tcW w:type="dxa" w:w="2600"/>
+          </w:tcPr>
+          <w:p>
+            <w:r>
+              <w:t>Primary-gate conformance</w:t>
+            </w:r>
+          </w:p>
+        </w:tc>
+        <w:tc>
+          <w:tcPr>
+            <w:tcW w:type="dxa" w:w="1700"/>
+          </w:tcPr>
+          <w:p>
+            <w:r>
+              <w:t>28/30</w:t>
+            </w:r>
+          </w:p>
+        </w:tc>
+        <w:tc>
+          <w:tcPr>
+            <w:tcW w:type="dxa" w:w="5060"/>
+          </w:tcPr>
+          <w:p>
+            <w:r>
+              <w:t>PGX19 and PGX24 differ because citation support fires before endpoint or population fit.</w:t>
+            </w:r>
+          </w:p>
+        </w:tc>
+      </w:tr>
+      <w:tr>
+        <w:tc>
+          <w:tcPr>
+            <w:tcW w:type="dxa" w:w="2600"/>
+          </w:tcPr>
+          <w:p>
+            <w:r>
+              <w:t>Inappropriate denial</w:t>
+            </w:r>
+          </w:p>
+        </w:tc>
+        <w:tc>
+          <w:tcPr>
+            <w:tcW w:type="dxa" w:w="1700"/>
+          </w:tcPr>
+          <w:p>
+            <w:r>
               <w:t>0/10</w:t>
             </w:r>
           </w:p>
@@ -768,7 +743,6 @@
         <w:tc>
           <w:tcPr>
             <w:tcW w:type="dxa" w:w="5060"/>
-            <w:vAlign w:val="center"/>
           </w:tcPr>
           <w:p>
             <w:r>
@@ -817,6 +791,11 @@
             </a:graphic>
           </wp:inline>
         </w:drawing>
+      </w:r>
+    </w:p>
+    <w:p>
+      <w:r>
+        <w:t>Error analysis: PGX19 and PGX24 are action-level successes but primary-gate mismatches. In both cases, citation/guideline support fires before the gate that motivated the case design. This exposes the controller precedence order and prevents the Stage 1 result from being presented as a perfect gate-identification result.</w:t>
       </w:r>
     </w:p>
     <w:p>
@@ -918,7 +897,7 @@
         <w:rPr>
           <w:rFonts w:ascii="Calibri" w:hAnsi="Calibri"/>
         </w:rPr>
-        <w:t>The most important limitation is that the present results are synthetic and author-designed. They demonstrate that the implementation follows the intended rules, not that the system generalizes. The final paper should be honest about that limitation because it is exactly the epistemic discipline the project asks LLMs to follow.</w:t>
+        <w:t>The most important limitation is that the present results are synthetic and author-designed. They demonstrate that the implementation follows the intended action rules, not that the system generalizes. A second limitation is that the hardest upstream task is assumed rather than solved: the case bank supplies structured evidence annotations instead of extracting them from live LLM output, citations, or EHR context.</w:t>
       </w:r>
     </w:p>
     <w:p>

</xml_diff>

<commit_message>
Improve ML4H formatting and ethics framing
</commit_message>
<xml_diff>
--- a/paper/Module_14_Final_Paper_Pruned_Evidence_Gate_Ravi_Bajaj.docx
+++ b/paper/Module_14_Final_Paper_Pruned_Evidence_Gate_Ravi_Bajaj.docx
@@ -40,7 +40,7 @@
           <w:color w:val="555555"/>
           <w:sz w:val="19"/>
         </w:rPr>
-        <w:t>Author: Ravi Bajaj | Target venue: ML4H 2026 Findings or Proceedings Track | Course: AI in Healthcare</w:t>
+        <w:t>Anonymous ML4H 2026 Findings Track draft</w:t>
       </w:r>
     </w:p>
     <w:p>
@@ -53,10 +53,7 @@
     </w:p>
     <w:p>
       <w:r>
-        <w:rPr>
-          <w:rFonts w:ascii="Calibri" w:hAnsi="Calibri"/>
-        </w:rPr>
-        <w:t>Large language models can draft fluent medication alerts that sound stronger than the evidence they cite. This paper narrows the capstone to one workflow: pharmacogenomic and genomic medication-alert text. I implement a synthetic pre-display evidence gate with three checks: citation/guideline support, population fit, and endpoint/actionability. Stage 1 does not call an LLM or extract evidence features from free text; it tests a deterministic controller over structured evidence annotations. In 30 author-designed synthetic cases, the controller blocked or narrowed all 20 designed overclaim archetypes, allowed all 10 bounded alerts, and produced no inappropriate denials. Action conformance was 30/30, while primary-gate conformance was 28/30 because citation-first precedence changed the recorded primary gate for PGX19 and PGX24. These counts demonstrate specification conformance against the author-designed case bank, not independent clinical safety, diagnostic accuracy, generalization, or patient benefit.</w:t>
+        <w:t>Large language models can draft medication alerts whose fluency exceeds the evidence they cite. This paper studies one workflow: pharmacogenomic and genomic medication-alert text. I implement a synthetic pre-display evidence gate with three checks: citation/guideline support, population fit, and endpoint/actionability. Stage 1 does not call an LLM or parse free text; it tests a deterministic controller over structured annotations. In 30 author-designed synthetic cases, the controller blocked or narrowed all 20 designed overclaim archetypes, allowed all 10 bounded alerts, and produced no inappropriate denials. Action conformance was 30/30; primary-gate conformance was 28/30. These are specification-conformance results, not clinical safety, generalization, or patient-benefit evidence.</w:t>
       </w:r>
     </w:p>
     <w:p>
@@ -69,10 +66,7 @@
     </w:p>
     <w:p>
       <w:r>
-        <w:rPr>
-          <w:rFonts w:ascii="Calibri" w:hAnsi="Calibri"/>
-        </w:rPr>
-        <w:t>The prior capstone package showed that a large set of mathematical and assurance ideas could be connected to medical LLM evaluation. The reviewer-facing problem is that breadth weakened the causal chain. This revision makes pruning the method: one workflow, one failure mode, three gates, and a measurable evaluation plan.</w:t>
+        <w:t>Healthcare LLMs can make evidentiary overreach look syntactically clean. A medication alert may cite a real guideline while turning a bounded pharmacogenomic recommendation into a universal instruction, a population-specific association into a transported claim, or a surrogate endpoint into patient-outcome benefit. The gap matters because fluency can hide what evidence does, and does not, authorize.</w:t>
       </w:r>
     </w:p>
     <w:p>
@@ -80,7 +74,7 @@
         <w:rPr>
           <w:rFonts w:ascii="Calibri" w:hAnsi="Calibri"/>
         </w:rPr>
-        <w:t>The chosen workflow is pharmacogenomic or genomic medication-alert text. It is attractive because guideline resources such as CPIC and ClinPGx already distinguish genotype, phenotype, evidence level, and prescribing recommendation. That creates a concrete setting where an LLM can be audited for a specific error: converting real but limited evidence into a stronger clinical claim.</w:t>
+        <w:t>Pharmacogenomic medication alerts are a useful testbed because guideline resources such as CPIC and ClinPGx already distinguish genotype, phenotype, evidence level, and prescribing recommendation. That creates a concrete setting for auditing a narrow failure mode: converting real but limited evidence into stronger clinical authority.</w:t>
       </w:r>
     </w:p>
     <w:p>
@@ -96,7 +90,7 @@
         <w:rPr>
           <w:rFonts w:ascii="Calibri" w:hAnsi="Calibri"/>
         </w:rPr>
-        <w:t>The course theme from Byrne, Domenico, and Moore is that patient-outcome claims for healthcare AI require pragmatic clinical evaluation. Stegenga's Medical Nihilism motivates caution when evidentiary pipelines make interventions appear stronger than they are. FDA-NIH BEST materials provide the endpoint vocabulary: biomarkers, surrogate endpoints, validated surrogates, and clinical outcomes are not interchangeable.</w:t>
+        <w:t>Healthcare AI evaluation should distinguish implementation consistency from patient-outcome benefit. Byrne, Domenico, and Moore emphasize that outcome claims require pragmatic clinical evaluation. Stegenga's Medical Nihilism motivates caution when evidentiary pipelines make interventions appear stronger than they are. FDA-NIH BEST materials provide the endpoint vocabulary: biomarkers, surrogate endpoints, validated surrogates, and clinical outcomes are not interchangeable.</w:t>
       </w:r>
     </w:p>
     <w:p>
@@ -117,17 +111,14 @@
     </w:p>
     <w:p>
       <w:r>
-        <w:rPr>
-          <w:rFonts w:ascii="Calibri" w:hAnsi="Calibri"/>
-        </w:rPr>
-        <w:t>The controller is a deterministic pre-display gate. It is not presented as an autonomous clinical agent. In Stage 1, it receives a synthetic candidate alert plus structured evidence annotations assigned in the case bank; it does not parse the draft_claim text, call an LLM, verify citations, or extract EHR/population-fit features. Those extraction tasks are the central Stage 2 dependency. The fixed precedence order is citation/guideline support first, population fit second, and endpoint/actionability third. The controller selects one of five permission levels: allow bounded alert, narrow claim, abstain for population fit, abstain for citation/guideline support, or deny unsupported action.</w:t>
+        <w:t>The controller is a deterministic pre-display gate, not an autonomous clinical agent. In Stage 1, it receives a synthetic candidate alert plus structured evidence annotations assigned in the case bank; it does not parse draft_claim text, call an LLM, verify citations, or extract EHR/population features. The fixed precedence order is citation/guideline support, population fit, then endpoint/actionability. The controller returns one of five permissions: allow, narrow, abstain for population fit, abstain for citation support, or deny unsupported action.</w:t>
       </w:r>
     </w:p>
     <w:p>
       <w:r>
         <w:drawing>
           <wp:inline xmlns:a="http://schemas.openxmlformats.org/drawingml/2006/main" xmlns:pic="http://schemas.openxmlformats.org/drawingml/2006/picture">
-            <wp:extent cx="5669280" cy="3023616"/>
+            <wp:extent cx="4572000" cy="2438400"/>
             <wp:docPr id="1" name="Picture 1"/>
             <wp:cNvGraphicFramePr>
               <a:graphicFrameLocks noChangeAspect="1"/>
@@ -148,7 +139,7 @@
                   <pic:spPr>
                     <a:xfrm>
                       <a:off x="0" y="0"/>
-                      <a:ext cx="5669280" cy="3023616"/>
+                      <a:ext cx="4572000" cy="2438400"/>
                     </a:xfrm>
                     <a:prstGeom prst="rect"/>
                   </pic:spPr>
@@ -375,17 +366,14 @@
     </w:p>
     <w:p>
       <w:r>
-        <w:rPr>
-          <w:rFonts w:ascii="Calibri" w:hAnsi="Calibri"/>
-        </w:rPr>
-        <w:t>The current case bank contains 30 author-designed synthetic cases. Ten are bounded aligned alerts; twenty intentionally contain overclaim archetypes involving universal action language, unsupported genetics, population mismatch, citation/guideline weakness, variant uncertainty, or obsolete/context-shifted evidence. The 20/10 split is a stress-test design choice, not a measured clinical base rate. Each case has an expected action and expected primary gate, but the controller does not read either expected label.</w:t>
+        <w:t>The case bank contains 30 author-designed synthetic cases: 10 bounded aligned alerts and 20 overclaim archetypes involving universal action language, unsupported genetics, population mismatch, citation weakness, variant uncertainty, or obsolete/context-shifted evidence. The 20/10 split is stress-test coverage, not a clinical base rate. Each case has expected labels, but the controller does not read them.</w:t>
       </w:r>
     </w:p>
     <w:p>
       <w:r>
         <w:drawing>
           <wp:inline xmlns:a="http://schemas.openxmlformats.org/drawingml/2006/main" xmlns:pic="http://schemas.openxmlformats.org/drawingml/2006/picture">
-            <wp:extent cx="5394960" cy="3452774"/>
+            <wp:extent cx="4023360" cy="2574950"/>
             <wp:docPr id="2" name="Picture 2"/>
             <wp:cNvGraphicFramePr>
               <a:graphicFrameLocks noChangeAspect="1"/>
@@ -406,7 +394,7 @@
                   <pic:spPr>
                     <a:xfrm>
                       <a:off x="0" y="0"/>
-                      <a:ext cx="5394960" cy="3452774"/>
+                      <a:ext cx="4023360" cy="2574950"/>
                     </a:xfrm>
                     <a:prstGeom prst="rect"/>
                   </pic:spPr>
@@ -759,57 +747,7 @@
     </w:p>
     <w:p>
       <w:r>
-        <w:drawing>
-          <wp:inline xmlns:a="http://schemas.openxmlformats.org/drawingml/2006/main" xmlns:pic="http://schemas.openxmlformats.org/drawingml/2006/picture">
-            <wp:extent cx="5394960" cy="3160166"/>
-            <wp:docPr id="3" name="Picture 3"/>
-            <wp:cNvGraphicFramePr>
-              <a:graphicFrameLocks noChangeAspect="1"/>
-            </wp:cNvGraphicFramePr>
-            <a:graphic>
-              <a:graphicData uri="http://schemas.openxmlformats.org/drawingml/2006/picture">
-                <pic:pic>
-                  <pic:nvPicPr>
-                    <pic:cNvPr id="0" name="pruned_gate_counts.png"/>
-                    <pic:cNvPicPr/>
-                  </pic:nvPicPr>
-                  <pic:blipFill>
-                    <a:blip r:embed="rId12"/>
-                    <a:stretch>
-                      <a:fillRect/>
-                    </a:stretch>
-                  </pic:blipFill>
-                  <pic:spPr>
-                    <a:xfrm>
-                      <a:off x="0" y="0"/>
-                      <a:ext cx="5394960" cy="3160166"/>
-                    </a:xfrm>
-                    <a:prstGeom prst="rect"/>
-                  </pic:spPr>
-                </pic:pic>
-              </a:graphicData>
-            </a:graphic>
-          </wp:inline>
-        </w:drawing>
-      </w:r>
-    </w:p>
-    <w:p>
-      <w:r>
         <w:t>Error analysis: PGX19 and PGX24 are action-level successes but primary-gate mismatches. In both cases, citation/guideline support fires before the gate that motivated the case design. This exposes the controller precedence order and prevents the Stage 1 result from being presented as a perfect gate-identification result.</w:t>
-      </w:r>
-    </w:p>
-    <w:p>
-      <w:pPr>
-        <w:jc w:val="center"/>
-      </w:pPr>
-      <w:r>
-        <w:rPr>
-          <w:rFonts w:ascii="Calibri" w:hAnsi="Calibri"/>
-          <w:i/>
-          <w:color w:val="555555"/>
-          <w:sz w:val="18"/>
-        </w:rPr>
-        <w:t>Figure 3. Primary gate selected by the deterministic controller.</w:t>
       </w:r>
     </w:p>
     <w:p>
@@ -817,7 +755,7 @@
         <w:pStyle w:val="Heading1"/>
       </w:pPr>
       <w:r>
-        <w:t>5. Planned Stage 2</w:t>
+        <w:t>5. Evaluation Plan</w:t>
       </w:r>
     </w:p>
     <w:p>
@@ -825,7 +763,7 @@
         <w:rPr>
           <w:rFonts w:ascii="Calibri" w:hAnsi="Calibri"/>
         </w:rPr>
-        <w:t>Stage 2 is the part that would make the paper clinically interpretable. It should compare ungated LLM drafts with gated drafts on independently authored cases. Reviewers should be blinded to arm when feasible and should classify overclaiming, inappropriate denial, preserved clinician authority, population-fit concerns, citation support, and error category.</w:t>
+        <w:t>The proposed independent evaluation compares ungated LLM drafts with gated drafts on independently authored cases. Reviewers should be blinded to arm when feasible and should classify overclaiming, inappropriate denial, preserved clinician authority, population-fit concerns, citation support, and error category.</w:t>
       </w:r>
     </w:p>
     <w:p>
@@ -881,23 +819,32 @@
         <w:pStyle w:val="Heading1"/>
       </w:pPr>
       <w:r>
-        <w:t>6. Discussion</w:t>
+        <w:t>6. Ethics, Governance, and Limitations</w:t>
       </w:r>
     </w:p>
     <w:p>
       <w:r>
-        <w:rPr>
-          <w:rFonts w:ascii="Calibri" w:hAnsi="Calibri"/>
-        </w:rPr>
-        <w:t>The key lesson is that an LLM does not need to be proven clinically useful before it can be disciplined. A pre-display gate can enforce a smaller claim grammar: a guideline supports a bounded alert, a population mismatch forces abstention, and an unverifiable citation carries no medical authority. This is not a substitute for pragmatic trials; it is a way to prevent a paper, product, or alert from claiming more than its evidence can bear.</w:t>
+        <w:t>The governance value of the gate is transparency. The controller is deterministic, auditable, and intentionally non-agentic: each alert can show which evidence feature triggered allow, narrow, abstain, or deny. Abstention is a governance action rather than a failure state; it preserves clinician authority when evidence is stale, conflicting, or poorly transported.</w:t>
       </w:r>
     </w:p>
     <w:p>
       <w:r>
-        <w:rPr>
-          <w:rFonts w:ascii="Calibri" w:hAnsi="Calibri"/>
-        </w:rPr>
-        <w:t>The most important limitation is that the present results are synthetic and author-designed. They demonstrate that the implementation follows the intended action rules, not that the system generalizes. A second limitation is that the hardest upstream task is assumed rather than solved: the case bank supplies structured evidence annotations instead of extracting them from live LLM output, citations, or EHR context.</w:t>
+        <w:t>Fairness and bias are central in pharmacogenomics. HLA-B*15:02 risk language is ancestry-conditional, founder-variant evidence may not transport to general US populations, and biobank results can misfit underrepresented or recently admixed groups. PGX09, PGX10, PGX25, PGX26, and PGX27 treat population fit as an equity constraint.</w:t>
+      </w:r>
+    </w:p>
+    <w:p>
+      <w:r>
+        <w:t>PGX24 marks the highest-risk boundary: using a polygenic score to deny opioid or stimulant therapy. That may become algorithmic denial of analgesia or psychiatric care. A defensible alert system should separate metabolism/safety guidance from unsupported addiction-liability claims.</w:t>
+      </w:r>
+    </w:p>
+    <w:p>
+      <w:r>
+        <w:t>Regulatory placement matters. Stage 1 contains no PHI and makes no diagnosis or treatment recommendation. Deployed clinical decision support would still need accountability for extraction, citation verification, thresholds, overrides, and audit logging.</w:t>
+      </w:r>
+    </w:p>
+    <w:p>
+      <w:r>
+        <w:t>The key limitation is that results are synthetic and author-designed. They show rule conformance, not generalization, and assume structured evidence annotations rather than extracting them from live LLM output or EHR context.</w:t>
       </w:r>
     </w:p>
     <w:p>
@@ -910,15 +857,13 @@
     </w:p>
     <w:p>
       <w:r>
-        <w:rPr>
-          <w:rFonts w:ascii="Calibri" w:hAnsi="Calibri"/>
-        </w:rPr>
-        <w:t>A cohesive capstone can be built from the original implementation by pruning. The revised project studies one practical genetics workflow and evaluates whether a three-gate controller can discipline LLM alert text so it does not inflate guideline-supported evidence into unsupported clinical authority.</w:t>
+        <w:t>This small deterministic evidence gate separates bounded guideline support from unsupported action, population transport, and citation overreach. It is a Findings-track design and evaluation-plan artifact with a repaired reference implementation.</w:t>
       </w:r>
     </w:p>
     <w:p>
       <w:pPr>
         <w:pStyle w:val="Heading1"/>
+        <w:pageBreakBefore/>
       </w:pPr>
       <w:r>
         <w:t>References and Web Sources</w:t>
@@ -1182,7 +1127,6 @@
         <w:color w:val="555555"/>
         <w:sz w:val="17"/>
       </w:rPr>
-      <w:t>Ravi Bajaj - Pruned Evidence Gate Paper Draft - August 8, 2026</w:t>
     </w:r>
   </w:p>
 </w:ftr>

</xml_diff>

<commit_message>
Add ablation and ML4H submission scaffold
</commit_message>
<xml_diff>
--- a/paper/Module_14_Final_Paper_Pruned_Evidence_Gate_Ravi_Bajaj.docx
+++ b/paper/Module_14_Final_Paper_Pruned_Evidence_Gate_Ravi_Bajaj.docx
@@ -746,6 +746,387 @@
       </w:pPr>
     </w:p>
     <w:p>
+      <w:pPr/>
+      <w:r>
+        <w:t>Gate ablation: removing endpoint/actionability allows 6 of 20 designed overclaims through unchanged; removing citation/guideline support or population fit changes the action/gate path without allowing overclaims in this synthetic bank. This shows different gate roles rather than independent clinical validity.</w:t>
+      </w:r>
+    </w:p>
+    <w:p>
+      <w:pPr>
+        <w:jc w:val="center"/>
+      </w:pPr>
+      <w:r>
+        <w:rPr>
+          <w:i/>
+          <w:sz w:val="18"/>
+        </w:rPr>
+        <w:t>Table 2. One-gate ablation on author-designed synthetic cases.</w:t>
+      </w:r>
+    </w:p>
+    <w:tbl>
+      <w:tblPr>
+        <w:tblStyle w:val="TableGrid"/>
+        <w:tblW w:type="auto" w:w="0"/>
+        <w:jc w:val="center"/>
+        <w:tblLook w:firstColumn="1" w:firstRow="1" w:lastColumn="0" w:lastRow="0" w:noHBand="0" w:noVBand="1" w:val="04A0"/>
+      </w:tblPr>
+      <w:tblGrid>
+        <w:gridCol w:w="1958"/>
+        <w:gridCol w:w="1958"/>
+        <w:gridCol w:w="1958"/>
+        <w:gridCol w:w="1958"/>
+        <w:gridCol w:w="1958"/>
+      </w:tblGrid>
+      <w:tr>
+        <w:tc>
+          <w:tcPr>
+            <w:tcW w:type="dxa" w:w="1958"/>
+            <w:vAlign w:val="center"/>
+          </w:tcPr>
+          <w:p>
+            <w:pPr>
+              <w:spacing w:after="0"/>
+            </w:pPr>
+            <w:r>
+              <w:rPr>
+                <w:sz w:val="16"/>
+              </w:rPr>
+              <w:t>Disabled gate</w:t>
+            </w:r>
+          </w:p>
+        </w:tc>
+        <w:tc>
+          <w:tcPr>
+            <w:tcW w:type="dxa" w:w="1958"/>
+            <w:vAlign w:val="center"/>
+          </w:tcPr>
+          <w:p>
+            <w:pPr>
+              <w:spacing w:after="0"/>
+            </w:pPr>
+            <w:r>
+              <w:rPr>
+                <w:sz w:val="16"/>
+              </w:rPr>
+              <w:t>Overclaims allowed</w:t>
+            </w:r>
+          </w:p>
+        </w:tc>
+        <w:tc>
+          <w:tcPr>
+            <w:tcW w:type="dxa" w:w="1958"/>
+            <w:vAlign w:val="center"/>
+          </w:tcPr>
+          <w:p>
+            <w:pPr>
+              <w:spacing w:after="0"/>
+            </w:pPr>
+            <w:r>
+              <w:rPr>
+                <w:sz w:val="16"/>
+              </w:rPr>
+              <w:t>Blocked</w:t>
+            </w:r>
+          </w:p>
+        </w:tc>
+        <w:tc>
+          <w:tcPr>
+            <w:tcW w:type="dxa" w:w="1958"/>
+            <w:vAlign w:val="center"/>
+          </w:tcPr>
+          <w:p>
+            <w:pPr>
+              <w:spacing w:after="0"/>
+            </w:pPr>
+            <w:r>
+              <w:rPr>
+                <w:sz w:val="16"/>
+              </w:rPr>
+              <w:t>Action changes</w:t>
+            </w:r>
+          </w:p>
+        </w:tc>
+        <w:tc>
+          <w:tcPr>
+            <w:tcW w:type="dxa" w:w="1958"/>
+            <w:vAlign w:val="center"/>
+          </w:tcPr>
+          <w:p>
+            <w:pPr>
+              <w:spacing w:after="0"/>
+            </w:pPr>
+            <w:r>
+              <w:rPr>
+                <w:sz w:val="16"/>
+              </w:rPr>
+              <w:t>Gate changes</w:t>
+            </w:r>
+          </w:p>
+        </w:tc>
+      </w:tr>
+      <w:tr>
+        <w:tc>
+          <w:tcPr>
+            <w:tcW w:type="dxa" w:w="1958"/>
+            <w:vAlign w:val="center"/>
+          </w:tcPr>
+          <w:p>
+            <w:pPr>
+              <w:spacing w:after="0"/>
+            </w:pPr>
+            <w:r>
+              <w:rPr>
+                <w:sz w:val="16"/>
+              </w:rPr>
+              <w:t>Citation/guideline</w:t>
+            </w:r>
+          </w:p>
+        </w:tc>
+        <w:tc>
+          <w:tcPr>
+            <w:tcW w:type="dxa" w:w="1958"/>
+            <w:vAlign w:val="center"/>
+          </w:tcPr>
+          <w:p>
+            <w:pPr>
+              <w:spacing w:after="0"/>
+            </w:pPr>
+            <w:r>
+              <w:rPr>
+                <w:sz w:val="16"/>
+              </w:rPr>
+              <w:t>0</w:t>
+            </w:r>
+          </w:p>
+        </w:tc>
+        <w:tc>
+          <w:tcPr>
+            <w:tcW w:type="dxa" w:w="1958"/>
+            <w:vAlign w:val="center"/>
+          </w:tcPr>
+          <w:p>
+            <w:pPr>
+              <w:spacing w:after="0"/>
+            </w:pPr>
+            <w:r>
+              <w:rPr>
+                <w:sz w:val="16"/>
+              </w:rPr>
+              <w:t>20</w:t>
+            </w:r>
+          </w:p>
+        </w:tc>
+        <w:tc>
+          <w:tcPr>
+            <w:tcW w:type="dxa" w:w="1958"/>
+            <w:vAlign w:val="center"/>
+          </w:tcPr>
+          <w:p>
+            <w:pPr>
+              <w:spacing w:after="0"/>
+            </w:pPr>
+            <w:r>
+              <w:rPr>
+                <w:sz w:val="16"/>
+              </w:rPr>
+              <w:t>5</w:t>
+            </w:r>
+          </w:p>
+        </w:tc>
+        <w:tc>
+          <w:tcPr>
+            <w:tcW w:type="dxa" w:w="1958"/>
+            <w:vAlign w:val="center"/>
+          </w:tcPr>
+          <w:p>
+            <w:pPr>
+              <w:spacing w:after="0"/>
+            </w:pPr>
+            <w:r>
+              <w:rPr>
+                <w:sz w:val="16"/>
+              </w:rPr>
+              <w:t>10</w:t>
+            </w:r>
+          </w:p>
+        </w:tc>
+      </w:tr>
+      <w:tr>
+        <w:tc>
+          <w:tcPr>
+            <w:tcW w:type="dxa" w:w="1958"/>
+            <w:vAlign w:val="center"/>
+          </w:tcPr>
+          <w:p>
+            <w:pPr>
+              <w:spacing w:after="0"/>
+            </w:pPr>
+            <w:r>
+              <w:rPr>
+                <w:sz w:val="16"/>
+              </w:rPr>
+              <w:t>Population fit</w:t>
+            </w:r>
+          </w:p>
+        </w:tc>
+        <w:tc>
+          <w:tcPr>
+            <w:tcW w:type="dxa" w:w="1958"/>
+            <w:vAlign w:val="center"/>
+          </w:tcPr>
+          <w:p>
+            <w:pPr>
+              <w:spacing w:after="0"/>
+            </w:pPr>
+            <w:r>
+              <w:rPr>
+                <w:sz w:val="16"/>
+              </w:rPr>
+              <w:t>0</w:t>
+            </w:r>
+          </w:p>
+        </w:tc>
+        <w:tc>
+          <w:tcPr>
+            <w:tcW w:type="dxa" w:w="1958"/>
+            <w:vAlign w:val="center"/>
+          </w:tcPr>
+          <w:p>
+            <w:pPr>
+              <w:spacing w:after="0"/>
+            </w:pPr>
+            <w:r>
+              <w:rPr>
+                <w:sz w:val="16"/>
+              </w:rPr>
+              <w:t>20</w:t>
+            </w:r>
+          </w:p>
+        </w:tc>
+        <w:tc>
+          <w:tcPr>
+            <w:tcW w:type="dxa" w:w="1958"/>
+            <w:vAlign w:val="center"/>
+          </w:tcPr>
+          <w:p>
+            <w:pPr>
+              <w:spacing w:after="0"/>
+            </w:pPr>
+            <w:r>
+              <w:rPr>
+                <w:sz w:val="16"/>
+              </w:rPr>
+              <w:t>4</w:t>
+            </w:r>
+          </w:p>
+        </w:tc>
+        <w:tc>
+          <w:tcPr>
+            <w:tcW w:type="dxa" w:w="1958"/>
+            <w:vAlign w:val="center"/>
+          </w:tcPr>
+          <w:p>
+            <w:pPr>
+              <w:spacing w:after="0"/>
+            </w:pPr>
+            <w:r>
+              <w:rPr>
+                <w:sz w:val="16"/>
+              </w:rPr>
+              <w:t>4</w:t>
+            </w:r>
+          </w:p>
+        </w:tc>
+      </w:tr>
+      <w:tr>
+        <w:tc>
+          <w:tcPr>
+            <w:tcW w:type="dxa" w:w="1958"/>
+            <w:vAlign w:val="center"/>
+          </w:tcPr>
+          <w:p>
+            <w:pPr>
+              <w:spacing w:after="0"/>
+            </w:pPr>
+            <w:r>
+              <w:rPr>
+                <w:sz w:val="16"/>
+              </w:rPr>
+              <w:t>Endpoint/actionability</w:t>
+            </w:r>
+          </w:p>
+        </w:tc>
+        <w:tc>
+          <w:tcPr>
+            <w:tcW w:type="dxa" w:w="1958"/>
+            <w:vAlign w:val="center"/>
+          </w:tcPr>
+          <w:p>
+            <w:pPr>
+              <w:spacing w:after="0"/>
+            </w:pPr>
+            <w:r>
+              <w:rPr>
+                <w:sz w:val="16"/>
+              </w:rPr>
+              <w:t>6</w:t>
+            </w:r>
+          </w:p>
+        </w:tc>
+        <w:tc>
+          <w:tcPr>
+            <w:tcW w:type="dxa" w:w="1958"/>
+            <w:vAlign w:val="center"/>
+          </w:tcPr>
+          <w:p>
+            <w:pPr>
+              <w:spacing w:after="0"/>
+            </w:pPr>
+            <w:r>
+              <w:rPr>
+                <w:sz w:val="16"/>
+              </w:rPr>
+              <w:t>14</w:t>
+            </w:r>
+          </w:p>
+        </w:tc>
+        <w:tc>
+          <w:tcPr>
+            <w:tcW w:type="dxa" w:w="1958"/>
+            <w:vAlign w:val="center"/>
+          </w:tcPr>
+          <w:p>
+            <w:pPr>
+              <w:spacing w:after="0"/>
+            </w:pPr>
+            <w:r>
+              <w:rPr>
+                <w:sz w:val="16"/>
+              </w:rPr>
+              <w:t>6</w:t>
+            </w:r>
+          </w:p>
+        </w:tc>
+        <w:tc>
+          <w:tcPr>
+            <w:tcW w:type="dxa" w:w="1958"/>
+            <w:vAlign w:val="center"/>
+          </w:tcPr>
+          <w:p>
+            <w:pPr>
+              <w:spacing w:after="0"/>
+            </w:pPr>
+            <w:r>
+              <w:rPr>
+                <w:sz w:val="16"/>
+              </w:rPr>
+              <w:t>6</w:t>
+            </w:r>
+          </w:p>
+        </w:tc>
+      </w:tr>
+    </w:tbl>
+    <w:p>
       <w:r>
         <w:t>Error analysis: PGX19 and PGX24 are action-level successes but primary-gate mismatches. In both cases, citation/guideline support fires before the gate that motivated the case design. This exposes the controller precedence order and prevents the Stage 1 result from being presented as a perfect gate-identification result.</w:t>
       </w:r>
@@ -857,7 +1238,7 @@
     </w:p>
     <w:p>
       <w:r>
-        <w:t>This small deterministic evidence gate separates bounded guideline support from unsupported action, population transport, and citation overreach. It is a Findings-track design and evaluation-plan artifact with a repaired reference implementation.</w:t>
+        <w:t>This small deterministic evidence gate separates bounded guideline support from unsupported action, population transport, and citation overreach. It is a Findings-track design and evaluation-plan artifact with a reference implementation.</w:t>
       </w:r>
     </w:p>
     <w:p>

</xml_diff>

<commit_message>
Add isolating ablations and repair ML4H package
</commit_message>
<xml_diff>
--- a/paper/Module_14_Final_Paper_Pruned_Evidence_Gate_Ravi_Bajaj.docx
+++ b/paper/Module_14_Final_Paper_Pruned_Evidence_Gate_Ravi_Bajaj.docx
@@ -53,7 +53,7 @@
     </w:p>
     <w:p>
       <w:r>
-        <w:t>Large language models can draft medication alerts whose fluency exceeds the evidence they cite. This paper studies one workflow: pharmacogenomic and genomic medication-alert text. I implement a synthetic pre-display evidence gate with three checks: citation/guideline support, population fit, and endpoint/actionability. Stage 1 does not call an LLM or parse free text; it tests a deterministic controller over structured annotations. In 30 author-designed synthetic cases, the controller blocked or narrowed all 20 designed overclaim archetypes, allowed all 10 bounded alerts, and produced no inappropriate denials. Action conformance was 30/30; primary-gate conformance was 28/30. These are specification-conformance results, not clinical safety, generalization, or patient-benefit evidence.</w:t>
+        <w:t>Large language models can draft medication alerts whose fluency exceeds the evidence they cite. This paper studies one workflow: pharmacogenomic and genomic medication-alert text. I implement a synthetic pre-display evidence gate with three checks: citation/guideline support, population fit, and endpoint/actionability. Stage 1 does not call an LLM or parse free text; it tests a deterministic controller over structured annotations. In 33 author-designed synthetic cases, the controller blocked or narrowed all 23 designed overclaim archetypes, allowed all 10 bounded alerts, and produced no inappropriate denials. Action conformance was 33/33; primary-gate conformance was 31/33. These are specification-conformance results, not clinical safety, generalization, or patient-benefit evidence.</w:t>
       </w:r>
     </w:p>
     <w:p>
@@ -366,14 +366,17 @@
     </w:p>
     <w:p>
       <w:r>
-        <w:t>The case bank contains 30 author-designed synthetic cases: 10 bounded aligned alerts and 20 overclaim archetypes involving universal action language, unsupported genetics, population mismatch, citation weakness, variant uncertainty, or obsolete/context-shifted evidence. The 20/10 split is stress-test coverage, not a clinical base rate. Each case has expected labels, but the controller does not read them.</w:t>
+        <w:t>The case bank contains 33 author-designed synthetic cases: 10 bounded aligned alerts and 23 overclaim archetypes involving universal action language, unsupported genetics, population mismatch, citation weakness, variant uncertainty, obsolete/context-shifted evidence, and three isolating cases. The 23/10 split is stress-test coverage, not a clinical base rate. Each case has expected labels, but the controller does not read them.</w:t>
       </w:r>
     </w:p>
     <w:p>
+      <w:pPr>
+        <w:jc w:val="center"/>
+      </w:pPr>
       <w:r>
         <w:drawing>
           <wp:inline xmlns:a="http://schemas.openxmlformats.org/drawingml/2006/main" xmlns:pic="http://schemas.openxmlformats.org/drawingml/2006/picture">
-            <wp:extent cx="4023360" cy="2574950"/>
+            <wp:extent cx="4023360" cy="2310917"/>
             <wp:docPr id="2" name="Picture 2"/>
             <wp:cNvGraphicFramePr>
               <a:graphicFrameLocks noChangeAspect="1"/>
@@ -386,7 +389,7 @@
                     <pic:cNvPicPr/>
                   </pic:nvPicPr>
                   <pic:blipFill>
-                    <a:blip r:embed="rId11"/>
+                    <a:blip r:embed="rId13"/>
                     <a:stretch>
                       <a:fillRect/>
                     </a:stretch>
@@ -394,7 +397,7 @@
                   <pic:spPr>
                     <a:xfrm>
                       <a:off x="0" y="0"/>
-                      <a:ext cx="4023360" cy="2574950"/>
+                      <a:ext cx="4023360" cy="2310917"/>
                     </a:xfrm>
                     <a:prstGeom prst="rect"/>
                   </pic:spPr>
@@ -519,7 +522,7 @@
           </w:tcPr>
           <w:p>
             <w:r>
-              <w:t>20/30</w:t>
+              <w:t>23/33</w:t>
             </w:r>
           </w:p>
         </w:tc>
@@ -554,7 +557,7 @@
           </w:tcPr>
           <w:p>
             <w:r>
-              <w:t>0/20</w:t>
+              <w:t>0/23</w:t>
             </w:r>
           </w:p>
         </w:tc>
@@ -589,7 +592,7 @@
           </w:tcPr>
           <w:p>
             <w:r>
-              <w:t>20/20</w:t>
+              <w:t>23/23</w:t>
             </w:r>
           </w:p>
         </w:tc>
@@ -659,7 +662,7 @@
           </w:tcPr>
           <w:p>
             <w:r>
-              <w:t>30/30</w:t>
+              <w:t>33/33</w:t>
             </w:r>
           </w:p>
         </w:tc>
@@ -692,7 +695,7 @@
           </w:tcPr>
           <w:p>
             <w:r>
-              <w:t>28/30</w:t>
+              <w:t>31/33</w:t>
             </w:r>
           </w:p>
         </w:tc>
@@ -748,7 +751,7 @@
     <w:p>
       <w:pPr/>
       <w:r>
-        <w:t>Gate ablation: removing endpoint/actionability allows 6 of 20 designed overclaims through unchanged; removing citation/guideline support or population fit changes the action/gate path without allowing overclaims in this synthetic bank. This shows different gate roles rather than independent clinical validity.</w:t>
+        <w:t>Gate ablation: removing citation/guideline support allows 2 of 23 designed overclaims through unchanged, removing population fit allows 1 of 23 through, and removing endpoint/actionability allows 6 of 23 through. The added isolating cases make each gate uniquely necessary for at least one failure archetype in this synthetic bank.</w:t>
       </w:r>
     </w:p>
     <w:p>
@@ -771,16 +774,15 @@
         <w:tblLook w:firstColumn="1" w:firstRow="1" w:lastColumn="0" w:lastRow="0" w:noHBand="0" w:noVBand="1" w:val="04A0"/>
       </w:tblPr>
       <w:tblGrid>
-        <w:gridCol w:w="1958"/>
-        <w:gridCol w:w="1958"/>
-        <w:gridCol w:w="1958"/>
-        <w:gridCol w:w="1958"/>
-        <w:gridCol w:w="1958"/>
+        <w:gridCol w:w="2448"/>
+        <w:gridCol w:w="2448"/>
+        <w:gridCol w:w="2448"/>
+        <w:gridCol w:w="2448"/>
       </w:tblGrid>
       <w:tr>
         <w:tc>
           <w:tcPr>
-            <w:tcW w:type="dxa" w:w="1958"/>
+            <w:tcW w:type="dxa" w:w="2448"/>
             <w:vAlign w:val="center"/>
           </w:tcPr>
           <w:p>
@@ -797,7 +799,7 @@
         </w:tc>
         <w:tc>
           <w:tcPr>
-            <w:tcW w:type="dxa" w:w="1958"/>
+            <w:tcW w:type="dxa" w:w="2448"/>
             <w:vAlign w:val="center"/>
           </w:tcPr>
           <w:p>
@@ -814,24 +816,7 @@
         </w:tc>
         <w:tc>
           <w:tcPr>
-            <w:tcW w:type="dxa" w:w="1958"/>
-            <w:vAlign w:val="center"/>
-          </w:tcPr>
-          <w:p>
-            <w:pPr>
-              <w:spacing w:after="0"/>
-            </w:pPr>
-            <w:r>
-              <w:rPr>
-                <w:sz w:val="16"/>
-              </w:rPr>
-              <w:t>Blocked</w:t>
-            </w:r>
-          </w:p>
-        </w:tc>
-        <w:tc>
-          <w:tcPr>
-            <w:tcW w:type="dxa" w:w="1958"/>
+            <w:tcW w:type="dxa" w:w="2448"/>
             <w:vAlign w:val="center"/>
           </w:tcPr>
           <w:p>
@@ -848,7 +833,7 @@
         </w:tc>
         <w:tc>
           <w:tcPr>
-            <w:tcW w:type="dxa" w:w="1958"/>
+            <w:tcW w:type="dxa" w:w="2448"/>
             <w:vAlign w:val="center"/>
           </w:tcPr>
           <w:p>
@@ -867,7 +852,7 @@
       <w:tr>
         <w:tc>
           <w:tcPr>
-            <w:tcW w:type="dxa" w:w="1958"/>
+            <w:tcW w:type="dxa" w:w="2448"/>
             <w:vAlign w:val="center"/>
           </w:tcPr>
           <w:p>
@@ -884,7 +869,7 @@
         </w:tc>
         <w:tc>
           <w:tcPr>
-            <w:tcW w:type="dxa" w:w="1958"/>
+            <w:tcW w:type="dxa" w:w="2448"/>
             <w:vAlign w:val="center"/>
           </w:tcPr>
           <w:p>
@@ -895,13 +880,13 @@
               <w:rPr>
                 <w:sz w:val="16"/>
               </w:rPr>
-              <w:t>0</w:t>
+              <w:t>2</w:t>
             </w:r>
           </w:p>
         </w:tc>
         <w:tc>
           <w:tcPr>
-            <w:tcW w:type="dxa" w:w="1958"/>
+            <w:tcW w:type="dxa" w:w="2448"/>
             <w:vAlign w:val="center"/>
           </w:tcPr>
           <w:p>
@@ -912,13 +897,66 @@
               <w:rPr>
                 <w:sz w:val="16"/>
               </w:rPr>
-              <w:t>20</w:t>
+              <w:t>7</w:t>
             </w:r>
           </w:p>
         </w:tc>
         <w:tc>
           <w:tcPr>
-            <w:tcW w:type="dxa" w:w="1958"/>
+            <w:tcW w:type="dxa" w:w="2448"/>
+            <w:vAlign w:val="center"/>
+          </w:tcPr>
+          <w:p>
+            <w:pPr>
+              <w:spacing w:after="0"/>
+            </w:pPr>
+            <w:r>
+              <w:rPr>
+                <w:sz w:val="16"/>
+              </w:rPr>
+              <w:t>12</w:t>
+            </w:r>
+          </w:p>
+        </w:tc>
+      </w:tr>
+      <w:tr>
+        <w:tc>
+          <w:tcPr>
+            <w:tcW w:type="dxa" w:w="2448"/>
+            <w:vAlign w:val="center"/>
+          </w:tcPr>
+          <w:p>
+            <w:pPr>
+              <w:spacing w:after="0"/>
+            </w:pPr>
+            <w:r>
+              <w:rPr>
+                <w:sz w:val="16"/>
+              </w:rPr>
+              <w:t>Population fit</w:t>
+            </w:r>
+          </w:p>
+        </w:tc>
+        <w:tc>
+          <w:tcPr>
+            <w:tcW w:type="dxa" w:w="2448"/>
+            <w:vAlign w:val="center"/>
+          </w:tcPr>
+          <w:p>
+            <w:pPr>
+              <w:spacing w:after="0"/>
+            </w:pPr>
+            <w:r>
+              <w:rPr>
+                <w:sz w:val="16"/>
+              </w:rPr>
+              <w:t>1</w:t>
+            </w:r>
+          </w:p>
+        </w:tc>
+        <w:tc>
+          <w:tcPr>
+            <w:tcW w:type="dxa" w:w="2448"/>
             <w:vAlign w:val="center"/>
           </w:tcPr>
           <w:p>
@@ -935,7 +973,7 @@
         </w:tc>
         <w:tc>
           <w:tcPr>
-            <w:tcW w:type="dxa" w:w="1958"/>
+            <w:tcW w:type="dxa" w:w="2448"/>
             <w:vAlign w:val="center"/>
           </w:tcPr>
           <w:p>
@@ -946,7 +984,7 @@
               <w:rPr>
                 <w:sz w:val="16"/>
               </w:rPr>
-              <w:t>10</w:t>
+              <w:t>5</w:t>
             </w:r>
           </w:p>
         </w:tc>
@@ -954,94 +992,7 @@
       <w:tr>
         <w:tc>
           <w:tcPr>
-            <w:tcW w:type="dxa" w:w="1958"/>
-            <w:vAlign w:val="center"/>
-          </w:tcPr>
-          <w:p>
-            <w:pPr>
-              <w:spacing w:after="0"/>
-            </w:pPr>
-            <w:r>
-              <w:rPr>
-                <w:sz w:val="16"/>
-              </w:rPr>
-              <w:t>Population fit</w:t>
-            </w:r>
-          </w:p>
-        </w:tc>
-        <w:tc>
-          <w:tcPr>
-            <w:tcW w:type="dxa" w:w="1958"/>
-            <w:vAlign w:val="center"/>
-          </w:tcPr>
-          <w:p>
-            <w:pPr>
-              <w:spacing w:after="0"/>
-            </w:pPr>
-            <w:r>
-              <w:rPr>
-                <w:sz w:val="16"/>
-              </w:rPr>
-              <w:t>0</w:t>
-            </w:r>
-          </w:p>
-        </w:tc>
-        <w:tc>
-          <w:tcPr>
-            <w:tcW w:type="dxa" w:w="1958"/>
-            <w:vAlign w:val="center"/>
-          </w:tcPr>
-          <w:p>
-            <w:pPr>
-              <w:spacing w:after="0"/>
-            </w:pPr>
-            <w:r>
-              <w:rPr>
-                <w:sz w:val="16"/>
-              </w:rPr>
-              <w:t>20</w:t>
-            </w:r>
-          </w:p>
-        </w:tc>
-        <w:tc>
-          <w:tcPr>
-            <w:tcW w:type="dxa" w:w="1958"/>
-            <w:vAlign w:val="center"/>
-          </w:tcPr>
-          <w:p>
-            <w:pPr>
-              <w:spacing w:after="0"/>
-            </w:pPr>
-            <w:r>
-              <w:rPr>
-                <w:sz w:val="16"/>
-              </w:rPr>
-              <w:t>4</w:t>
-            </w:r>
-          </w:p>
-        </w:tc>
-        <w:tc>
-          <w:tcPr>
-            <w:tcW w:type="dxa" w:w="1958"/>
-            <w:vAlign w:val="center"/>
-          </w:tcPr>
-          <w:p>
-            <w:pPr>
-              <w:spacing w:after="0"/>
-            </w:pPr>
-            <w:r>
-              <w:rPr>
-                <w:sz w:val="16"/>
-              </w:rPr>
-              <w:t>4</w:t>
-            </w:r>
-          </w:p>
-        </w:tc>
-      </w:tr>
-      <w:tr>
-        <w:tc>
-          <w:tcPr>
-            <w:tcW w:type="dxa" w:w="1958"/>
+            <w:tcW w:type="dxa" w:w="2448"/>
             <w:vAlign w:val="center"/>
           </w:tcPr>
           <w:p>
@@ -1058,7 +1009,7 @@
         </w:tc>
         <w:tc>
           <w:tcPr>
-            <w:tcW w:type="dxa" w:w="1958"/>
+            <w:tcW w:type="dxa" w:w="2448"/>
             <w:vAlign w:val="center"/>
           </w:tcPr>
           <w:p>
@@ -1075,24 +1026,7 @@
         </w:tc>
         <w:tc>
           <w:tcPr>
-            <w:tcW w:type="dxa" w:w="1958"/>
-            <w:vAlign w:val="center"/>
-          </w:tcPr>
-          <w:p>
-            <w:pPr>
-              <w:spacing w:after="0"/>
-            </w:pPr>
-            <w:r>
-              <w:rPr>
-                <w:sz w:val="16"/>
-              </w:rPr>
-              <w:t>14</w:t>
-            </w:r>
-          </w:p>
-        </w:tc>
-        <w:tc>
-          <w:tcPr>
-            <w:tcW w:type="dxa" w:w="1958"/>
+            <w:tcW w:type="dxa" w:w="2448"/>
             <w:vAlign w:val="center"/>
           </w:tcPr>
           <w:p>
@@ -1109,7 +1043,7 @@
         </w:tc>
         <w:tc>
           <w:tcPr>
-            <w:tcW w:type="dxa" w:w="1958"/>
+            <w:tcW w:type="dxa" w:w="2448"/>
             <w:vAlign w:val="center"/>
           </w:tcPr>
           <w:p>

</xml_diff>